<commit_message>
feat(P4): ORG false-positive filter, ORG-to-PERSON relabelling, emit_org flag
Config-driven ORG filter (generic words, role phrases, governance unit
phrases, PII field labels) drops false positives before fusion. Legal-suffix
names are never filtered. Relabelling after entity resolution: an ORG span in
a person-like table column (Name, Employee, Contact, ...) becomes PERSON, and
an ORG span that matches exactly one resolved person becomes PERSON linked to
that identity. Both refuse legal suffixes and ambiguous matches. emit_org=False
keeps ORG for fusion and relabelling, then drops it from output.

Co-Authored-By: Claude Haiku 5.5 <noreply@anthropic.com>
</commit_message>
<xml_diff>
--- a/eval/samples/decoys_memo.docx
+++ b/eval/samples/decoys_memo.docx
@@ -33,6 +33,11 @@
     <w:p>
       <w:r>
         <w:t>In March 2026 the RSK-2024-0031 file was closed. The Monday review used USD 18,000.</w:t>
+      </w:r>
+    </w:p>
+    <w:p>
+      <w:r>
+        <w:t>Finance and Legal reviewed the file. Head of Compliance signed off. The SSN and DOB fields were checked by the Lagos Operations Team.</w:t>
       </w:r>
     </w:p>
     <w:sectPr>

</xml_diff>